<commit_message>
Mau xac minh hang loi Kho LGT: them duong ke duoi cho dong hang
Dong hang trong mau co 5 o dat bottom=nil nen dong cuoi bang bi ho day (anh huong
Doi tra hang DTP va Hang huy Kho DTP). Chi sua 5 duong ke trong word/document.xml,
cac file khac trong mau giu nguyen.

Co-Authored-By: Claude Opus 5.5 <noreply@anthropic.com>
</commit_message>
<xml_diff>
--- a/public/templates/BIEN_BAN_XAC_MINH_HANG_LOI_KHO_LGT.docx
+++ b/public/templates/BIEN_BAN_XAC_MINH_HANG_LOI_KHO_LGT.docx
@@ -1106,7 +1106,7 @@
             <w:tcBorders>
               <w:top w:val="single" w:sz="4" w:space="0" w:color="auto"/>
               <w:left w:val="single" w:sz="4" w:space="0" w:color="auto"/>
-              <w:bottom w:val="nil"/>
+              <w:bottom w:val="single" w:sz="4" w:space="0" w:color="auto"/>
               <w:right w:val="single" w:sz="4" w:space="0" w:color="auto"/>
             </w:tcBorders>
             <w:vAlign w:val="center"/>
@@ -1138,7 +1138,7 @@
             <w:tcBorders>
               <w:top w:val="single" w:sz="4" w:space="0" w:color="auto"/>
               <w:left w:val="single" w:sz="4" w:space="0" w:color="auto"/>
-              <w:bottom w:val="nil"/>
+              <w:bottom w:val="single" w:sz="4" w:space="0" w:color="auto"/>
               <w:right w:val="single" w:sz="4" w:space="0" w:color="auto"/>
             </w:tcBorders>
             <w:vAlign w:val="center"/>
@@ -1170,7 +1170,7 @@
             <w:tcBorders>
               <w:top w:val="single" w:sz="4" w:space="0" w:color="auto"/>
               <w:left w:val="single" w:sz="4" w:space="0" w:color="auto"/>
-              <w:bottom w:val="nil"/>
+              <w:bottom w:val="single" w:sz="4" w:space="0" w:color="auto"/>
               <w:right w:val="single" w:sz="4" w:space="0" w:color="auto"/>
             </w:tcBorders>
             <w:vAlign w:val="center"/>
@@ -1254,7 +1254,7 @@
             <w:tcBorders>
               <w:top w:val="single" w:sz="4" w:space="0" w:color="auto"/>
               <w:left w:val="single" w:sz="4" w:space="0" w:color="auto"/>
-              <w:bottom w:val="nil"/>
+              <w:bottom w:val="single" w:sz="4" w:space="0" w:color="auto"/>
               <w:right w:val="single" w:sz="4" w:space="0" w:color="auto"/>
             </w:tcBorders>
             <w:vAlign w:val="center"/>
@@ -1312,7 +1312,7 @@
             <w:tcBorders>
               <w:top w:val="single" w:sz="4" w:space="0" w:color="auto"/>
               <w:left w:val="single" w:sz="4" w:space="0" w:color="auto"/>
-              <w:bottom w:val="nil"/>
+              <w:bottom w:val="single" w:sz="4" w:space="0" w:color="auto"/>
               <w:right w:val="single" w:sz="4" w:space="0" w:color="auto"/>
             </w:tcBorders>
             <w:vAlign w:val="center"/>

</xml_diff>